<commit_message>
feat: Add PDF page management, multi-file PDF merge, and editor enhancements
</commit_message>
<xml_diff>
--- a/storage/documents/619914ff-d8e9-4212-b9f5-a17d220ad7fb.docx
+++ b/storage/documents/619914ff-d8e9-4212-b9f5-a17d220ad7fb.docx
@@ -31,7 +31,7 @@
           <wp:inline distT="0" distB="0" distL="0" distR="0">
             <wp:extent cx="2971800" cy="781050"/>
             <wp:effectExtent t="0" r="0" b="0" l="0"/>
-            <wp:docPr id="2" name=""/>
+            <wp:docPr id="1" name=""/>
             <wp:cNvGraphicFramePr>
               <a:graphicFrameLocks xmlns:a="http://schemas.openxmlformats.org/drawingml/2006/main" noChangeAspect="1"/>
             </wp:cNvGraphicFramePr>
@@ -89,6 +89,53 @@
       </w:pPr>
       <w:r>
         <w:t xml:space="preserve">Second item</w:t>
+      </w:r>
+    </w:p>
+    <w:p>
+      <w:r>
+        <w:br/>
+      </w:r>
+    </w:p>
+    <w:p>
+      <w:r>
+        <w:drawing>
+          <wp:inline distT="0" distB="0" distL="0" distR="0">
+            <wp:extent cx="4762500" cy="2733675"/>
+            <wp:effectExtent t="0" r="0" b="0" l="0"/>
+            <wp:docPr id="2" name=""/>
+            <wp:cNvGraphicFramePr>
+              <a:graphicFrameLocks xmlns:a="http://schemas.openxmlformats.org/drawingml/2006/main" noChangeAspect="1"/>
+            </wp:cNvGraphicFramePr>
+            <a:graphic xmlns:a="http://schemas.openxmlformats.org/drawingml/2006/main">
+              <a:graphicData uri="http://schemas.openxmlformats.org/drawingml/2006/picture">
+                <pic:pic xmlns:pic="http://schemas.openxmlformats.org/drawingml/2006/picture">
+                  <pic:nvPicPr>
+                    <pic:cNvPr id="0" name="" descr=""/>
+                    <pic:cNvPicPr>
+                      <a:picLocks noChangeAspect="1" noChangeArrowheads="1"/>
+                    </pic:cNvPicPr>
+                  </pic:nvPicPr>
+                  <pic:blipFill>
+                    <a:blip r:embed="rId8" cstate="none"/>
+                    <a:srcRect/>
+                    <a:stretch>
+                      <a:fillRect/>
+                    </a:stretch>
+                  </pic:blipFill>
+                  <pic:spPr bwMode="auto">
+                    <a:xfrm>
+                      <a:off x="0" y="0"/>
+                      <a:ext cx="4762500" cy="2733675"/>
+                    </a:xfrm>
+                    <a:prstGeom prst="rect">
+                      <a:avLst/>
+                    </a:prstGeom>
+                  </pic:spPr>
+                </pic:pic>
+              </a:graphicData>
+            </a:graphic>
+          </wp:inline>
+        </w:drawing>
       </w:r>
     </w:p>
     <w:sectPr>

</xml_diff>